<commit_message>
fix to new cv
</commit_message>
<xml_diff>
--- a/assets/docs/cv.docx
+++ b/assets/docs/cv.docx
@@ -20,8 +20,8 @@
       </w:tblPr>
       <w:tblGrid>
         <w:gridCol w:w="2965"/>
-        <w:gridCol w:w="4535"/>
-        <w:gridCol w:w="3402"/>
+        <w:gridCol w:w="4961"/>
+        <w:gridCol w:w="2976"/>
       </w:tblGrid>
       <w:tr>
         <w:trPr>
@@ -42,7 +42,7 @@
               <w:right w:w="100" w:type="dxa"/>
               <w:bottom w:w="0" w:type="dxa"/>
             </w:tcMar>
-            <w:tcW w:w="7500" w:type="dxa"/>
+            <w:tcW w:w="7926" w:type="dxa"/>
             <w:vAlign w:val="top"/>
           </w:tcPr>
           <w:p>
@@ -125,7 +125,7 @@
               <w:right w:w="100" w:type="dxa"/>
               <w:bottom w:w="0" w:type="dxa"/>
             </w:tcMar>
-            <w:tcW w:w="3402" w:type="dxa"/>
+            <w:tcW w:w="2976" w:type="dxa"/>
             <w:vAlign w:val="top"/>
             <w:vMerge w:val="restart"/>
           </w:tcPr>
@@ -440,7 +440,7 @@
               <w:right w:w="100" w:type="dxa"/>
               <w:bottom w:w="0" w:type="dxa"/>
             </w:tcMar>
-            <w:tcW w:w="4535" w:type="dxa"/>
+            <w:tcW w:w="4961" w:type="dxa"/>
             <w:vAlign w:val="top"/>
           </w:tcPr>
           <w:p>
@@ -629,7 +629,7 @@
                   <w:sz w:val="18"/>
                   <w:szCs w:val="18"/>
                 </w:rPr>
-                <w:t xml:space="preserve">researchgate.net/profile/Volodymyr_Shatalov</w:t>
+                <w:t xml:space="preserve">https://researchgate.net/profile/Volodymyr_Shatalov</w:t>
               </w:r>
             </w:hyperlink>
             <w:r>
@@ -1208,6 +1208,7 @@
                 <w:color w:val="000000"/>
                 <w:sz w:val="21"/>
                 <w:szCs w:val="21"/>
+                <w14:ligatures w14:val="none"/>
               </w:rPr>
             </w:r>
             <w:r>
@@ -1260,10 +1261,8 @@
             <w:r>
               <w:rPr>
                 <w:rFonts w:ascii="Arial" w:hAnsi="Arial" w:eastAsia="Arial" w:cs="Arial"/>
-                <w:b/>
-                <w:color w:val="000000"/>
                 <w:sz w:val="21"/>
-                <w:highlight w:val="none"/>
+                <w:szCs w:val="21"/>
               </w:rPr>
             </w:r>
             <w:r>
@@ -2024,7 +2023,12 @@
             <w:r>
               <w:rPr>
                 <w:rFonts w:ascii="Arial" w:hAnsi="Arial" w:eastAsia="Arial" w:cs="Arial"/>
+                <w:b/>
+                <w:bCs/>
+                <w:color w:val="008cff"/>
                 <w:sz w:val="20"/>
+                <w:szCs w:val="20"/>
+                <w:highlight w:val="none"/>
               </w:rPr>
             </w:r>
             <w:r>
@@ -2426,7 +2430,12 @@
             <w:r>
               <w:rPr>
                 <w:rFonts w:ascii="Arial" w:hAnsi="Arial" w:eastAsia="Arial" w:cs="Arial"/>
+                <w:b/>
+                <w:bCs/>
+                <w:color w:val="008cff"/>
                 <w:sz w:val="20"/>
+                <w:szCs w:val="20"/>
+                <w:highlight w:val="none"/>
               </w:rPr>
             </w:r>
             <w:r>
@@ -3019,7 +3028,11 @@
             </w:r>
             <w:r>
               <w:rPr>
-                <w:sz w:val="21"/>
+                <w:rFonts w:ascii="Arial" w:hAnsi="Arial" w:eastAsia="Arial" w:cs="Arial"/>
+                <w:color w:val="3e3e3e"/>
+                <w:sz w:val="17"/>
+                <w:szCs w:val="17"/>
+                <w:highlight w:val="none"/>
               </w:rPr>
             </w:r>
             <w:r>
@@ -3230,64 +3243,89 @@
                 <w:sz w:val="20"/>
                 <w:szCs w:val="20"/>
               </w:rPr>
-              <w:t xml:space="preserve">D</w:t>
             </w:r>
-            <w:r>
-              <w:rPr>
-                <w:rStyle w:val="884"/>
-                <w:rFonts w:ascii="Arial" w:hAnsi="Arial" w:eastAsia="Arial" w:cs="Arial"/>
-                <w:b/>
-                <w:bCs/>
-                <w:sz w:val="20"/>
-                <w:szCs w:val="20"/>
-                <w:lang w:val="en-US"/>
-              </w:rPr>
-              <w:t xml:space="preserve">r.</w:t>
-            </w:r>
-            <w:r>
-              <w:rPr>
-                <w:rStyle w:val="884"/>
-                <w:rFonts w:ascii="Arial" w:hAnsi="Arial" w:eastAsia="Arial" w:cs="Arial"/>
-                <w:b/>
-                <w:bCs/>
-                <w:sz w:val="20"/>
-                <w:szCs w:val="20"/>
-              </w:rPr>
-              <w:t xml:space="preserve">Sci</w:t>
-            </w:r>
-            <w:r>
-              <w:rPr>
-                <w:rStyle w:val="884"/>
-                <w:rFonts w:ascii="Arial" w:hAnsi="Arial" w:eastAsia="Arial" w:cs="Arial"/>
-                <w:b/>
-                <w:bCs/>
-                <w:sz w:val="20"/>
-                <w:szCs w:val="20"/>
-                <w:lang w:val="en-US"/>
-              </w:rPr>
-              <w:t xml:space="preserve">.</w:t>
-            </w:r>
-            <w:r>
-              <w:rPr>
-                <w:rStyle w:val="884"/>
-                <w:rFonts w:ascii="Arial" w:hAnsi="Arial" w:eastAsia="Arial" w:cs="Arial"/>
-                <w:b/>
-                <w:bCs/>
-                <w:sz w:val="20"/>
-                <w:szCs w:val="20"/>
-              </w:rPr>
-              <w:t xml:space="preserve"> Diploma</w:t>
-            </w:r>
-            <w:r>
-              <w:rPr>
-                <w:rStyle w:val="884"/>
-                <w:rFonts w:ascii="Arial" w:hAnsi="Arial" w:eastAsia="Arial" w:cs="Arial"/>
-                <w:b/>
-                <w:bCs/>
-                <w:sz w:val="20"/>
-                <w:szCs w:val="20"/>
-              </w:rPr>
-            </w:r>
+            <w:hyperlink r:id="rId26" w:tooltip="https://vshatalov.github.io/assets/docs/DrSci.png" w:history="1">
+              <w:r>
+                <w:rPr>
+                  <w:rStyle w:val="884"/>
+                  <w:rFonts w:ascii="Arial" w:hAnsi="Arial" w:eastAsia="Arial" w:cs="Arial"/>
+                  <w:b/>
+                  <w:bCs/>
+                  <w:sz w:val="20"/>
+                  <w:szCs w:val="20"/>
+                </w:rPr>
+                <w:t xml:space="preserve">D</w:t>
+              </w:r>
+              <w:r>
+                <w:rPr>
+                  <w:rStyle w:val="884"/>
+                  <w:rFonts w:ascii="Arial" w:hAnsi="Arial" w:eastAsia="Arial" w:cs="Arial"/>
+                  <w:b/>
+                  <w:bCs/>
+                  <w:sz w:val="20"/>
+                  <w:szCs w:val="20"/>
+                  <w:lang w:val="en-US"/>
+                </w:rPr>
+                <w:t xml:space="preserve">r.</w:t>
+              </w:r>
+              <w:r>
+                <w:rPr>
+                  <w:rStyle w:val="884"/>
+                  <w:rFonts w:ascii="Arial" w:hAnsi="Arial" w:eastAsia="Arial" w:cs="Arial"/>
+                  <w:b/>
+                  <w:bCs/>
+                  <w:sz w:val="20"/>
+                  <w:szCs w:val="20"/>
+                </w:rPr>
+                <w:t xml:space="preserve">Sci</w:t>
+              </w:r>
+              <w:r>
+                <w:rPr>
+                  <w:rStyle w:val="884"/>
+                  <w:rFonts w:ascii="Arial" w:hAnsi="Arial" w:eastAsia="Arial" w:cs="Arial"/>
+                  <w:b/>
+                  <w:bCs/>
+                  <w:sz w:val="20"/>
+                  <w:szCs w:val="20"/>
+                  <w:lang w:val="en-US"/>
+                </w:rPr>
+                <w:t xml:space="preserve">.</w:t>
+              </w:r>
+              <w:r>
+                <w:rPr>
+                  <w:rStyle w:val="884"/>
+                  <w:rFonts w:ascii="Arial" w:hAnsi="Arial" w:eastAsia="Arial" w:cs="Arial"/>
+                  <w:b/>
+                  <w:bCs/>
+                  <w:sz w:val="20"/>
+                  <w:szCs w:val="20"/>
+                </w:rPr>
+                <w:t xml:space="preserve"> Diploma</w:t>
+              </w:r>
+              <w:r>
+                <w:rPr>
+                  <w:rStyle w:val="884"/>
+                  <w:rFonts w:ascii="Arial" w:hAnsi="Arial" w:eastAsia="Arial" w:cs="Arial"/>
+                  <w:b/>
+                  <w:bCs/>
+                  <w:sz w:val="20"/>
+                  <w:szCs w:val="20"/>
+                  <w14:ligatures w14:val="none"/>
+                </w:rPr>
+              </w:r>
+              <w:r>
+                <w:rPr>
+                  <w:rStyle w:val="884"/>
+                  <w:rFonts w:ascii="Arial" w:hAnsi="Arial" w:eastAsia="Arial" w:cs="Arial"/>
+                  <w:b/>
+                  <w:bCs/>
+                  <w:sz w:val="20"/>
+                  <w:szCs w:val="20"/>
+                  <w14:ligatures w14:val="none"/>
+                </w:rPr>
+              </w:r>
+            </w:hyperlink>
+            <w:r/>
             <w:r>
               <w:rPr>
                 <w:rStyle w:val="884"/>
@@ -3608,7 +3646,7 @@
                 <w:szCs w:val="20"/>
               </w:rPr>
             </w:r>
-            <w:hyperlink r:id="rId26" w:tooltip="https://vshatalov.github.io/assets/docs/PhD.png" w:history="1">
+            <w:hyperlink r:id="rId27" w:tooltip="https://vshatalov.github.io/assets/docs/PhD.png" w:history="1">
               <w:r>
                 <w:rPr>
                   <w:rStyle w:val="884"/>
@@ -4012,7 +4050,7 @@
                 <w:szCs w:val="20"/>
               </w:rPr>
             </w:r>
-            <w:hyperlink r:id="rId27" w:tooltip="https://vshatalov.github.io/assets/docs/MS.png" w:history="1">
+            <w:hyperlink r:id="rId28" w:tooltip="https://vshatalov.github.io/assets/docs/MS.png" w:history="1">
               <w:r>
                 <w:rPr>
                   <w:rStyle w:val="884"/>
@@ -4033,6 +4071,7 @@
                 <w:bCs/>
                 <w:sz w:val="20"/>
                 <w:szCs w:val="20"/>
+                <w14:ligatures w14:val="none"/>
               </w:rPr>
             </w:r>
             <w:r>
@@ -4088,6 +4127,8 @@
                 <w:color w:val="008cff"/>
                 <w:sz w:val="20"/>
                 <w:szCs w:val="20"/>
+                <w:highlight w:val="none"/>
+                <w14:ligatures w14:val="none"/>
               </w:rPr>
             </w:r>
             <w:r>

</xml_diff>